<commit_message>
Master summary: P02 complete (ARK-483..492 all PASS), corpus totals updated
Grand total 60 experiments / 64 records / 61 PASS; 60/60 published. Soli Deo Gloria.
</commit_message>
<xml_diff>
--- a/RF_MASTER_SUMMARY_SCIENCE_PATENTS_TRADEMARKS.docx
+++ b/RF_MASTER_SUMMARY_SCIENCE_PATENTS_TRADEMARKS.docx
@@ -380,19 +380,19 @@
               <w:jc w:val="left"/>
             </w:pPr>
             <w:r>
-              <w:t xml:space="preserve">Quantum hardware (441–448) + classical software (449–484)</w:t>
-            </w:r>
-          </w:p>
-        </w:tc>
-        <w:tc>
-          <w:tcPr/>
-          <w:p>
-            <w:pPr>
-              <w:pStyle w:val="Compact"/>
-              <w:jc w:val="left"/>
-            </w:pPr>
-            <w:r>
-              <w:t xml:space="preserve">30 experiment IDs, 52 records — active</w:t>
+              <w:t xml:space="preserve">Quantum hardware (441–448) + classical software (449–492)</w:t>
+            </w:r>
+          </w:p>
+        </w:tc>
+        <w:tc>
+          <w:tcPr/>
+          <w:p>
+            <w:pPr>
+              <w:pStyle w:val="Compact"/>
+              <w:jc w:val="left"/>
+            </w:pPr>
+            <w:r>
+              <w:t xml:space="preserve">38 experiment IDs, 60 records — active</w:t>
             </w:r>
           </w:p>
         </w:tc>
@@ -656,7 +656,7 @@
         <w:t xml:space="preserve"> </w:t>
       </w:r>
       <w:r>
-        <w:t xml:space="preserve">52 case records across 30 experiment IDs →</w:t>
+        <w:t xml:space="preserve">60 case records across 38 experiment IDs →</w:t>
       </w:r>
       <w:r>
         <w:t xml:space="preserve"> </w:t>
@@ -666,7 +666,7 @@
           <w:bCs/>
           <w:b/>
         </w:rPr>
-        <w:t xml:space="preserve">49 PASS · 2 honest FAIL · 1 GATE-STOP</w:t>
+        <w:t xml:space="preserve">57 PASS · 2 honest FAIL · 1 GATE-STOP</w:t>
       </w:r>
       <w:r>
         <w:t xml:space="preserve">,</w:t>
@@ -679,10 +679,10 @@
           <w:bCs/>
           <w:b/>
         </w:rPr>
-        <w:t xml:space="preserve">48/48 Zenodo publications complete (100%)</w:t>
-      </w:r>
-      <w:r>
-        <w:t xml:space="preserve">. The BELLWETHER (3) and CHRONO (1) quantum-witness experiments are additionally published (4 more DOIs).</w:t>
+        <w:t xml:space="preserve">56/56 Zenodo publications complete (100%)</w:t>
+      </w:r>
+      <w:r>
+        <w:t xml:space="preserve">. P02 Latency/Throughput/Scale (ARK-483–492) complete 10/10. The BELLWETHER (3) and CHRONO (1) quantum-witness experiments are additionally published (4 more DOIs).</w:t>
       </w:r>
     </w:p>
     <w:p>
@@ -2481,13 +2481,13 @@
       </w:r>
     </w:p>
     <w:bookmarkEnd w:id="25"/>
-    <w:bookmarkStart w:id="26" w:name="X84767e0f8af091b462ab74e7eddc4a4ee70749c"/>
+    <w:bookmarkStart w:id="26" w:name="X8f3ca23c5618c1d999b5ea0752598eb85128cef"/>
     <w:p>
       <w:pPr>
         <w:pStyle w:val="Heading3"/>
       </w:pPr>
       <w:r>
-        <w:t xml:space="preserve">1.4 P02 Latency / Throughput Series (ARK-483–484) — 2/10 complete</w:t>
+        <w:t xml:space="preserve">1.4 P02 Latency / Throughput / Scale Series (ARK-483–492) — ✅ 10/10 COMPLETE</w:t>
       </w:r>
     </w:p>
     <w:p>
@@ -2495,7 +2495,23 @@
         <w:pStyle w:val="FirstParagraph"/>
       </w:pPr>
       <w:r>
-        <w:t xml:space="preserve">CUT = frozen ARK-458 guard (unchanged).</w:t>
+        <w:t xml:space="preserve">CUT = frozen ARK-458 guard (Verification Decision) + minimal in-memory reference Authority/Evidence engines (measurement only,</w:t>
+      </w:r>
+      <w:r>
+        <w:t xml:space="preserve"> </w:t>
+      </w:r>
+      <w:r>
+        <w:rPr>
+          <w:bCs/>
+          <w:b/>
+        </w:rPr>
+        <w:t xml:space="preserve">not</w:t>
+      </w:r>
+      <w:r>
+        <w:t xml:space="preserve"> </w:t>
+      </w:r>
+      <w:r>
+        <w:t xml:space="preserve">production engines).</w:t>
       </w:r>
     </w:p>
     <w:tbl>
@@ -2758,6 +2774,639 @@
           </w:p>
         </w:tc>
       </w:tr>
+      <w:tr>
+        <w:tc>
+          <w:tcPr/>
+          <w:p>
+            <w:pPr>
+              <w:pStyle w:val="Compact"/>
+              <w:jc w:val="left"/>
+            </w:pPr>
+            <w:r>
+              <w:t xml:space="preserve">485</w:t>
+            </w:r>
+          </w:p>
+        </w:tc>
+        <w:tc>
+          <w:tcPr/>
+          <w:p>
+            <w:pPr>
+              <w:pStyle w:val="Compact"/>
+              <w:jc w:val="left"/>
+            </w:pPr>
+            <w:r>
+              <w:t xml:space="preserve">Verification decision — sustained throughput</w:t>
+            </w:r>
+          </w:p>
+        </w:tc>
+        <w:tc>
+          <w:tcPr/>
+          <w:p>
+            <w:pPr>
+              <w:pStyle w:val="Compact"/>
+              <w:jc w:val="left"/>
+            </w:pPr>
+            <w:r>
+              <w:t xml:space="preserve">✅ PASS</w:t>
+            </w:r>
+          </w:p>
+        </w:tc>
+        <w:tc>
+          <w:tcPr/>
+          <w:p>
+            <w:pPr>
+              <w:pStyle w:val="Compact"/>
+              <w:jc w:val="left"/>
+            </w:pPr>
+            <w:r>
+              <w:rPr>
+                <w:bCs/>
+                <w:b/>
+              </w:rPr>
+              <w:t xml:space="preserve">1.50M dec/s</w:t>
+            </w:r>
+            <w:r>
+              <w:t xml:space="preserve"> </w:t>
+            </w:r>
+            <w:r>
+              <w:t xml:space="preserve">(Py) /</w:t>
+            </w:r>
+            <w:r>
+              <w:t xml:space="preserve"> </w:t>
+            </w:r>
+            <w:r>
+              <w:rPr>
+                <w:bCs/>
+                <w:b/>
+              </w:rPr>
+              <w:t xml:space="preserve">9.52M dec/s</w:t>
+            </w:r>
+            <w:r>
+              <w:t xml:space="preserve"> </w:t>
+            </w:r>
+            <w:r>
+              <w:t xml:space="preserve">(JS), 100% acc over 60s</w:t>
+            </w:r>
+          </w:p>
+        </w:tc>
+        <w:tc>
+          <w:tcPr/>
+          <w:p>
+            <w:pPr>
+              <w:pStyle w:val="Compact"/>
+              <w:jc w:val="left"/>
+            </w:pPr>
+            <w:r>
+              <w:t xml:space="preserve">10.5281/zenodo.21434398</w:t>
+            </w:r>
+          </w:p>
+        </w:tc>
+      </w:tr>
+      <w:tr>
+        <w:tc>
+          <w:tcPr/>
+          <w:p>
+            <w:pPr>
+              <w:pStyle w:val="Compact"/>
+              <w:jc w:val="left"/>
+            </w:pPr>
+            <w:r>
+              <w:t xml:space="preserve">486</w:t>
+            </w:r>
+          </w:p>
+        </w:tc>
+        <w:tc>
+          <w:tcPr/>
+          <w:p>
+            <w:pPr>
+              <w:pStyle w:val="Compact"/>
+              <w:jc w:val="left"/>
+            </w:pPr>
+            <w:r>
+              <w:t xml:space="preserve">Verification decision — cost at scale</w:t>
+            </w:r>
+          </w:p>
+        </w:tc>
+        <w:tc>
+          <w:tcPr/>
+          <w:p>
+            <w:pPr>
+              <w:pStyle w:val="Compact"/>
+              <w:jc w:val="left"/>
+            </w:pPr>
+            <w:r>
+              <w:t xml:space="preserve">✅ PASS</w:t>
+            </w:r>
+          </w:p>
+        </w:tc>
+        <w:tc>
+          <w:tcPr/>
+          <w:p>
+            <w:pPr>
+              <w:pStyle w:val="Compact"/>
+              <w:jc w:val="left"/>
+            </w:pPr>
+            <w:r>
+              <w:rPr>
+                <w:bCs/>
+                <w:b/>
+              </w:rPr>
+              <w:t xml:space="preserve">fixed prior FAIL</w:t>
+            </w:r>
+            <w:r>
+              <w:t xml:space="preserve">; Scenario B realistic</w:t>
+            </w:r>
+            <w:r>
+              <w:t xml:space="preserve"> </w:t>
+            </w:r>
+            <w:r>
+              <w:rPr>
+                <w:bCs/>
+                <w:b/>
+              </w:rPr>
+              <w:t xml:space="preserve">$7.47e-06/M</w:t>
+            </w:r>
+            <w:r>
+              <w:t xml:space="preserve"> </w:t>
+            </w:r>
+            <w:r>
+              <w:t xml:space="preserve">(Py) /</w:t>
+            </w:r>
+            <w:r>
+              <w:t xml:space="preserve"> </w:t>
+            </w:r>
+            <w:r>
+              <w:rPr>
+                <w:bCs/>
+                <w:b/>
+              </w:rPr>
+              <w:t xml:space="preserve">$1.18e-06/M</w:t>
+            </w:r>
+            <w:r>
+              <w:t xml:space="preserve"> </w:t>
+            </w:r>
+            <w:r>
+              <w:t xml:space="preserve">(JS); naive $0.20/M disclosed</w:t>
+            </w:r>
+          </w:p>
+        </w:tc>
+        <w:tc>
+          <w:tcPr/>
+          <w:p>
+            <w:pPr>
+              <w:pStyle w:val="Compact"/>
+              <w:jc w:val="left"/>
+            </w:pPr>
+            <w:r>
+              <w:t xml:space="preserve">10.5281/zenodo.21434400</w:t>
+            </w:r>
+          </w:p>
+        </w:tc>
+      </w:tr>
+      <w:tr>
+        <w:tc>
+          <w:tcPr/>
+          <w:p>
+            <w:pPr>
+              <w:pStyle w:val="Compact"/>
+              <w:jc w:val="left"/>
+            </w:pPr>
+            <w:r>
+              <w:t xml:space="preserve">487</w:t>
+            </w:r>
+          </w:p>
+        </w:tc>
+        <w:tc>
+          <w:tcPr/>
+          <w:p>
+            <w:pPr>
+              <w:pStyle w:val="Compact"/>
+              <w:jc w:val="left"/>
+            </w:pPr>
+            <w:r>
+              <w:t xml:space="preserve">Authority Engine — cold start</w:t>
+            </w:r>
+          </w:p>
+        </w:tc>
+        <w:tc>
+          <w:tcPr/>
+          <w:p>
+            <w:pPr>
+              <w:pStyle w:val="Compact"/>
+              <w:jc w:val="left"/>
+            </w:pPr>
+            <w:r>
+              <w:t xml:space="preserve">✅ PASS</w:t>
+            </w:r>
+          </w:p>
+        </w:tc>
+        <w:tc>
+          <w:tcPr/>
+          <w:p>
+            <w:pPr>
+              <w:pStyle w:val="Compact"/>
+              <w:jc w:val="left"/>
+            </w:pPr>
+            <w:r>
+              <w:t xml:space="preserve">p95</w:t>
+            </w:r>
+            <w:r>
+              <w:t xml:space="preserve"> </w:t>
+            </w:r>
+            <w:r>
+              <w:rPr>
+                <w:bCs/>
+                <w:b/>
+              </w:rPr>
+              <w:t xml:space="preserve">9.34 ms</w:t>
+            </w:r>
+            <w:r>
+              <w:t xml:space="preserve"> </w:t>
+            </w:r>
+            <w:r>
+              <w:t xml:space="preserve">(mean 7.87 ms); correctness gate PASS</w:t>
+            </w:r>
+          </w:p>
+        </w:tc>
+        <w:tc>
+          <w:tcPr/>
+          <w:p>
+            <w:pPr>
+              <w:pStyle w:val="Compact"/>
+              <w:jc w:val="left"/>
+            </w:pPr>
+            <w:r>
+              <w:t xml:space="preserve">10.5281/zenodo.21434402</w:t>
+            </w:r>
+          </w:p>
+        </w:tc>
+      </w:tr>
+      <w:tr>
+        <w:tc>
+          <w:tcPr/>
+          <w:p>
+            <w:pPr>
+              <w:pStyle w:val="Compact"/>
+              <w:jc w:val="left"/>
+            </w:pPr>
+            <w:r>
+              <w:t xml:space="preserve">488</w:t>
+            </w:r>
+          </w:p>
+        </w:tc>
+        <w:tc>
+          <w:tcPr/>
+          <w:p>
+            <w:pPr>
+              <w:pStyle w:val="Compact"/>
+              <w:jc w:val="left"/>
+            </w:pPr>
+            <w:r>
+              <w:t xml:space="preserve">Authority Engine — p95 latency</w:t>
+            </w:r>
+          </w:p>
+        </w:tc>
+        <w:tc>
+          <w:tcPr/>
+          <w:p>
+            <w:pPr>
+              <w:pStyle w:val="Compact"/>
+              <w:jc w:val="left"/>
+            </w:pPr>
+            <w:r>
+              <w:t xml:space="preserve">✅ PASS</w:t>
+            </w:r>
+          </w:p>
+        </w:tc>
+        <w:tc>
+          <w:tcPr/>
+          <w:p>
+            <w:pPr>
+              <w:pStyle w:val="Compact"/>
+              <w:jc w:val="left"/>
+            </w:pPr>
+            <w:r>
+              <w:t xml:space="preserve">warm p95</w:t>
+            </w:r>
+            <w:r>
+              <w:t xml:space="preserve"> </w:t>
+            </w:r>
+            <w:r>
+              <w:rPr>
+                <w:bCs/>
+                <w:b/>
+              </w:rPr>
+              <w:t xml:space="preserve">0.32 µs</w:t>
+            </w:r>
+            <w:r>
+              <w:t xml:space="preserve">, p99 0.41 µs (200k decisions)</w:t>
+            </w:r>
+          </w:p>
+        </w:tc>
+        <w:tc>
+          <w:tcPr/>
+          <w:p>
+            <w:pPr>
+              <w:pStyle w:val="Compact"/>
+              <w:jc w:val="left"/>
+            </w:pPr>
+            <w:r>
+              <w:t xml:space="preserve">10.5281/zenodo.21434405</w:t>
+            </w:r>
+          </w:p>
+        </w:tc>
+      </w:tr>
+      <w:tr>
+        <w:tc>
+          <w:tcPr/>
+          <w:p>
+            <w:pPr>
+              <w:pStyle w:val="Compact"/>
+              <w:jc w:val="left"/>
+            </w:pPr>
+            <w:r>
+              <w:t xml:space="preserve">489</w:t>
+            </w:r>
+          </w:p>
+        </w:tc>
+        <w:tc>
+          <w:tcPr/>
+          <w:p>
+            <w:pPr>
+              <w:pStyle w:val="Compact"/>
+              <w:jc w:val="left"/>
+            </w:pPr>
+            <w:r>
+              <w:t xml:space="preserve">Authority Engine — burst throughput</w:t>
+            </w:r>
+          </w:p>
+        </w:tc>
+        <w:tc>
+          <w:tcPr/>
+          <w:p>
+            <w:pPr>
+              <w:pStyle w:val="Compact"/>
+              <w:jc w:val="left"/>
+            </w:pPr>
+            <w:r>
+              <w:t xml:space="preserve">✅ PASS</w:t>
+            </w:r>
+          </w:p>
+        </w:tc>
+        <w:tc>
+          <w:tcPr/>
+          <w:p>
+            <w:pPr>
+              <w:pStyle w:val="Compact"/>
+              <w:jc w:val="left"/>
+            </w:pPr>
+            <w:r>
+              <w:rPr>
+                <w:bCs/>
+                <w:b/>
+              </w:rPr>
+              <w:t xml:space="preserve">3.09M dec/s</w:t>
+            </w:r>
+            <w:r>
+              <w:t xml:space="preserve">, 100% acc</w:t>
+            </w:r>
+          </w:p>
+        </w:tc>
+        <w:tc>
+          <w:tcPr/>
+          <w:p>
+            <w:pPr>
+              <w:pStyle w:val="Compact"/>
+              <w:jc w:val="left"/>
+            </w:pPr>
+            <w:r>
+              <w:t xml:space="preserve">10.5281/zenodo.21434407</w:t>
+            </w:r>
+          </w:p>
+        </w:tc>
+      </w:tr>
+      <w:tr>
+        <w:tc>
+          <w:tcPr/>
+          <w:p>
+            <w:pPr>
+              <w:pStyle w:val="Compact"/>
+              <w:jc w:val="left"/>
+            </w:pPr>
+            <w:r>
+              <w:t xml:space="preserve">490</w:t>
+            </w:r>
+          </w:p>
+        </w:tc>
+        <w:tc>
+          <w:tcPr/>
+          <w:p>
+            <w:pPr>
+              <w:pStyle w:val="Compact"/>
+              <w:jc w:val="left"/>
+            </w:pPr>
+            <w:r>
+              <w:t xml:space="preserve">Authority Engine — sustained throughput</w:t>
+            </w:r>
+          </w:p>
+        </w:tc>
+        <w:tc>
+          <w:tcPr/>
+          <w:p>
+            <w:pPr>
+              <w:pStyle w:val="Compact"/>
+              <w:jc w:val="left"/>
+            </w:pPr>
+            <w:r>
+              <w:t xml:space="preserve">✅ PASS</w:t>
+            </w:r>
+          </w:p>
+        </w:tc>
+        <w:tc>
+          <w:tcPr/>
+          <w:p>
+            <w:pPr>
+              <w:pStyle w:val="Compact"/>
+              <w:jc w:val="left"/>
+            </w:pPr>
+            <w:r>
+              <w:rPr>
+                <w:bCs/>
+                <w:b/>
+              </w:rPr>
+              <w:t xml:space="preserve">2.49M dec/s</w:t>
+            </w:r>
+            <w:r>
+              <w:t xml:space="preserve"> </w:t>
+            </w:r>
+            <w:r>
+              <w:t xml:space="preserve">over 60s, 100% acc (~81% of burst)</w:t>
+            </w:r>
+          </w:p>
+        </w:tc>
+        <w:tc>
+          <w:tcPr/>
+          <w:p>
+            <w:pPr>
+              <w:pStyle w:val="Compact"/>
+              <w:jc w:val="left"/>
+            </w:pPr>
+            <w:r>
+              <w:t xml:space="preserve">10.5281/zenodo.21434409</w:t>
+            </w:r>
+          </w:p>
+        </w:tc>
+      </w:tr>
+      <w:tr>
+        <w:tc>
+          <w:tcPr/>
+          <w:p>
+            <w:pPr>
+              <w:pStyle w:val="Compact"/>
+              <w:jc w:val="left"/>
+            </w:pPr>
+            <w:r>
+              <w:t xml:space="preserve">491</w:t>
+            </w:r>
+          </w:p>
+        </w:tc>
+        <w:tc>
+          <w:tcPr/>
+          <w:p>
+            <w:pPr>
+              <w:pStyle w:val="Compact"/>
+              <w:jc w:val="left"/>
+            </w:pPr>
+            <w:r>
+              <w:t xml:space="preserve">Authority Engine — cost at scale</w:t>
+            </w:r>
+          </w:p>
+        </w:tc>
+        <w:tc>
+          <w:tcPr/>
+          <w:p>
+            <w:pPr>
+              <w:pStyle w:val="Compact"/>
+              <w:jc w:val="left"/>
+            </w:pPr>
+            <w:r>
+              <w:t xml:space="preserve">✅ PASS</w:t>
+            </w:r>
+          </w:p>
+        </w:tc>
+        <w:tc>
+          <w:tcPr/>
+          <w:p>
+            <w:pPr>
+              <w:pStyle w:val="Compact"/>
+              <w:jc w:val="left"/>
+            </w:pPr>
+            <w:r>
+              <w:t xml:space="preserve">Scenario B</w:t>
+            </w:r>
+            <w:r>
+              <w:t xml:space="preserve"> </w:t>
+            </w:r>
+            <w:r>
+              <w:rPr>
+                <w:bCs/>
+                <w:b/>
+              </w:rPr>
+              <w:t xml:space="preserve">$3.59e-06/M</w:t>
+            </w:r>
+            <w:r>
+              <w:t xml:space="preserve">; naive $0.20/M disclosed</w:t>
+            </w:r>
+          </w:p>
+        </w:tc>
+        <w:tc>
+          <w:tcPr/>
+          <w:p>
+            <w:pPr>
+              <w:pStyle w:val="Compact"/>
+              <w:jc w:val="left"/>
+            </w:pPr>
+            <w:r>
+              <w:t xml:space="preserve">10.5281/zenodo.21434411</w:t>
+            </w:r>
+          </w:p>
+        </w:tc>
+      </w:tr>
+      <w:tr>
+        <w:tc>
+          <w:tcPr/>
+          <w:p>
+            <w:pPr>
+              <w:pStyle w:val="Compact"/>
+              <w:jc w:val="left"/>
+            </w:pPr>
+            <w:r>
+              <w:t xml:space="preserve">492</w:t>
+            </w:r>
+          </w:p>
+        </w:tc>
+        <w:tc>
+          <w:tcPr/>
+          <w:p>
+            <w:pPr>
+              <w:pStyle w:val="Compact"/>
+              <w:jc w:val="left"/>
+            </w:pPr>
+            <w:r>
+              <w:t xml:space="preserve">Evidence Engine — cold start</w:t>
+            </w:r>
+          </w:p>
+        </w:tc>
+        <w:tc>
+          <w:tcPr/>
+          <w:p>
+            <w:pPr>
+              <w:pStyle w:val="Compact"/>
+              <w:jc w:val="left"/>
+            </w:pPr>
+            <w:r>
+              <w:t xml:space="preserve">✅ PASS</w:t>
+            </w:r>
+          </w:p>
+        </w:tc>
+        <w:tc>
+          <w:tcPr/>
+          <w:p>
+            <w:pPr>
+              <w:pStyle w:val="Compact"/>
+              <w:jc w:val="left"/>
+            </w:pPr>
+            <w:r>
+              <w:t xml:space="preserve">p95</w:t>
+            </w:r>
+            <w:r>
+              <w:t xml:space="preserve"> </w:t>
+            </w:r>
+            <w:r>
+              <w:rPr>
+                <w:bCs/>
+                <w:b/>
+              </w:rPr>
+              <w:t xml:space="preserve">44.0 ms</w:t>
+            </w:r>
+            <w:r>
+              <w:t xml:space="preserve">; tamper + broken-chain correctly DENY</w:t>
+            </w:r>
+          </w:p>
+        </w:tc>
+        <w:tc>
+          <w:tcPr/>
+          <w:p>
+            <w:pPr>
+              <w:pStyle w:val="Compact"/>
+              <w:jc w:val="left"/>
+            </w:pPr>
+            <w:r>
+              <w:t xml:space="preserve">10.5281/zenodo.21434413</w:t>
+            </w:r>
+          </w:p>
+        </w:tc>
+      </w:tr>
     </w:tbl>
     <w:p>
       <w:pPr>
@@ -2768,7 +3417,7 @@
           <w:iCs/>
           <w:i/>
         </w:rPr>
-        <w:t xml:space="preserve">Honest finding: DENY is slower than ALLOW in both implementations (reason-string formatting dominates the tail, not comparison work). Disclosed.</w:t>
+        <w:t xml:space="preserve">Honest findings: (a) DENY slower than ALLOW in ARK-483 (reason-string formatting dominates tail). (b) ARK-486 corrected a cost-model category error (per-request serverless price per in-process decision) → verdict on realistic running-service model, naive bound disclosed. (c) ARK-487–492 measure minimal in-memory reference engines, not production engines; claims bounded to single-threaded in-memory load. All disclosed.</w:t>
       </w:r>
     </w:p>
     <w:p>
@@ -6399,43 +7048,43 @@
               <w:jc w:val="left"/>
             </w:pPr>
             <w:r>
-              <w:t xml:space="preserve">ARK P02 Latency (483–484)</w:t>
-            </w:r>
-          </w:p>
-        </w:tc>
-        <w:tc>
-          <w:tcPr/>
-          <w:p>
-            <w:pPr>
-              <w:pStyle w:val="Compact"/>
-              <w:jc w:val="left"/>
-            </w:pPr>
-            <w:r>
-              <w:t xml:space="preserve">2</w:t>
-            </w:r>
-          </w:p>
-        </w:tc>
-        <w:tc>
-          <w:tcPr/>
-          <w:p>
-            <w:pPr>
-              <w:pStyle w:val="Compact"/>
-              <w:jc w:val="left"/>
-            </w:pPr>
-            <w:r>
-              <w:t xml:space="preserve">2</w:t>
-            </w:r>
-          </w:p>
-        </w:tc>
-        <w:tc>
-          <w:tcPr/>
-          <w:p>
-            <w:pPr>
-              <w:pStyle w:val="Compact"/>
-              <w:jc w:val="left"/>
-            </w:pPr>
-            <w:r>
-              <w:t xml:space="preserve">2</w:t>
+              <w:t xml:space="preserve">ARK P02 Latency/Throughput/Scale (483–492)</w:t>
+            </w:r>
+          </w:p>
+        </w:tc>
+        <w:tc>
+          <w:tcPr/>
+          <w:p>
+            <w:pPr>
+              <w:pStyle w:val="Compact"/>
+              <w:jc w:val="left"/>
+            </w:pPr>
+            <w:r>
+              <w:t xml:space="preserve">10</w:t>
+            </w:r>
+          </w:p>
+        </w:tc>
+        <w:tc>
+          <w:tcPr/>
+          <w:p>
+            <w:pPr>
+              <w:pStyle w:val="Compact"/>
+              <w:jc w:val="left"/>
+            </w:pPr>
+            <w:r>
+              <w:t xml:space="preserve">10</w:t>
+            </w:r>
+          </w:p>
+        </w:tc>
+        <w:tc>
+          <w:tcPr/>
+          <w:p>
+            <w:pPr>
+              <w:pStyle w:val="Compact"/>
+              <w:jc w:val="left"/>
+            </w:pPr>
+            <w:r>
+              <w:t xml:space="preserve">10</w:t>
             </w:r>
           </w:p>
         </w:tc>
@@ -6471,7 +7120,7 @@
               <w:jc w:val="left"/>
             </w:pPr>
             <w:r>
-              <w:t xml:space="preserve">2/2 ✓</w:t>
+              <w:t xml:space="preserve">10/10 ✓</w:t>
             </w:r>
           </w:p>
         </w:tc>
@@ -6591,7 +7240,7 @@
                 <w:bCs/>
                 <w:b/>
               </w:rPr>
-              <w:t xml:space="preserve">48</w:t>
+              <w:t xml:space="preserve">56</w:t>
             </w:r>
           </w:p>
         </w:tc>
@@ -6607,7 +7256,7 @@
                 <w:bCs/>
                 <w:b/>
               </w:rPr>
-              <w:t xml:space="preserve">52</w:t>
+              <w:t xml:space="preserve">60</w:t>
             </w:r>
           </w:p>
         </w:tc>
@@ -6623,7 +7272,7 @@
                 <w:bCs/>
                 <w:b/>
               </w:rPr>
-              <w:t xml:space="preserve">49</w:t>
+              <w:t xml:space="preserve">57</w:t>
             </w:r>
           </w:p>
         </w:tc>
@@ -6671,7 +7320,7 @@
                 <w:bCs/>
                 <w:b/>
               </w:rPr>
-              <w:t xml:space="preserve">48/48 ✓</w:t>
+              <w:t xml:space="preserve">56/56 ✓</w:t>
             </w:r>
           </w:p>
         </w:tc>
@@ -6877,7 +7526,7 @@
                 <w:bCs/>
                 <w:b/>
               </w:rPr>
-              <w:t xml:space="preserve">52</w:t>
+              <w:t xml:space="preserve">60</w:t>
             </w:r>
           </w:p>
         </w:tc>
@@ -6893,7 +7542,7 @@
                 <w:bCs/>
                 <w:b/>
               </w:rPr>
-              <w:t xml:space="preserve">56</w:t>
+              <w:t xml:space="preserve">64</w:t>
             </w:r>
           </w:p>
         </w:tc>
@@ -6909,7 +7558,7 @@
                 <w:bCs/>
                 <w:b/>
               </w:rPr>
-              <w:t xml:space="preserve">53</w:t>
+              <w:t xml:space="preserve">61</w:t>
             </w:r>
           </w:p>
         </w:tc>
@@ -6957,7 +7606,7 @@
                 <w:bCs/>
                 <w:b/>
               </w:rPr>
-              <w:t xml:space="preserve">52/52 ✓</w:t>
+              <w:t xml:space="preserve">60/60 ✓</w:t>
             </w:r>
           </w:p>
         </w:tc>
@@ -7057,13 +7706,13 @@
           <w:bCs/>
           <w:b/>
         </w:rPr>
-        <w:t xml:space="preserve">P02 Latency/Throughput (483–507)</w:t>
-      </w:r>
-      <w:r>
-        <w:t xml:space="preserve"> </w:t>
-      </w:r>
-      <w:r>
-        <w:t xml:space="preserve">— in progress (483–484 done); next ARK-485–492 (Verification-Decision throughput/cost + Authority Engine)</w:t>
+        <w:t xml:space="preserve">P02 Latency/Throughput/Scale (483–492)</w:t>
+      </w:r>
+      <w:r>
+        <w:t xml:space="preserve"> </w:t>
+      </w:r>
+      <w:r>
+        <w:t xml:space="preserve">— ✅ complete (10/10 PASS, all published); next P03 Dependency Cascade (ARK-493+)</w:t>
       </w:r>
     </w:p>
     <w:p>

</xml_diff>